<commit_message>
Organización de ciclo 2025 02 en ISIL
</commit_message>
<xml_diff>
--- a/2025-01/ModeloDeNegociosYStartups-4726/Arregla-pe/4726-PA3-ChristopherPinedo.docx
+++ b/2025-01/ModeloDeNegociosYStartups-4726/Arregla-pe/4726-PA3-ChristopherPinedo.docx
@@ -532,7 +532,7 @@
           <w:r>
             <w:fldChar w:fldCharType="separate"/>
           </w:r>
-          <w:hyperlink w:anchor="_Toc201759692" w:history="1">
+          <w:hyperlink w:anchor="_Toc202186804" w:history="1">
             <w:r>
               <w:rPr>
                 <w:rStyle w:val="Hipervnculo"/>
@@ -559,7 +559,7 @@
                 <w:noProof/>
                 <w:webHidden/>
               </w:rPr>
-              <w:instrText xml:space="preserve"> PAGEREF _Toc201759692 \h </w:instrText>
+              <w:instrText xml:space="preserve"> PAGEREF _Toc202186804 \h </w:instrText>
             </w:r>
             <w:r>
               <w:rPr>
@@ -603,7 +603,7 @@
               <w:lang w:eastAsia="es-ES"/>
             </w:rPr>
           </w:pPr>
-          <w:hyperlink w:anchor="_Toc201759693" w:history="1">
+          <w:hyperlink w:anchor="_Toc202186805" w:history="1">
             <w:r>
               <w:rPr>
                 <w:rStyle w:val="Hipervnculo"/>
@@ -630,7 +630,7 @@
                 <w:noProof/>
                 <w:webHidden/>
               </w:rPr>
-              <w:instrText xml:space="preserve"> PAGEREF _Toc201759693 \h </w:instrText>
+              <w:instrText xml:space="preserve"> PAGEREF _Toc202186805 \h </w:instrText>
             </w:r>
             <w:r>
               <w:rPr>
@@ -674,7 +674,7 @@
               <w:lang w:eastAsia="es-ES"/>
             </w:rPr>
           </w:pPr>
-          <w:hyperlink w:anchor="_Toc201759694" w:history="1">
+          <w:hyperlink w:anchor="_Toc202186806" w:history="1">
             <w:r>
               <w:rPr>
                 <w:rStyle w:val="Hipervnculo"/>
@@ -701,7 +701,7 @@
                 <w:noProof/>
                 <w:webHidden/>
               </w:rPr>
-              <w:instrText xml:space="preserve"> PAGEREF _Toc201759694 \h </w:instrText>
+              <w:instrText xml:space="preserve"> PAGEREF _Toc202186806 \h </w:instrText>
             </w:r>
             <w:r>
               <w:rPr>
@@ -745,7 +745,7 @@
               <w:lang w:eastAsia="es-ES"/>
             </w:rPr>
           </w:pPr>
-          <w:hyperlink w:anchor="_Toc201759695" w:history="1">
+          <w:hyperlink w:anchor="_Toc202186807" w:history="1">
             <w:r>
               <w:rPr>
                 <w:rStyle w:val="Hipervnculo"/>
@@ -772,7 +772,7 @@
                 <w:noProof/>
                 <w:webHidden/>
               </w:rPr>
-              <w:instrText xml:space="preserve"> PAGEREF _Toc201759695 \h </w:instrText>
+              <w:instrText xml:space="preserve"> PAGEREF _Toc202186807 \h </w:instrText>
             </w:r>
             <w:r>
               <w:rPr>
@@ -816,7 +816,7 @@
               <w:lang w:eastAsia="es-ES"/>
             </w:rPr>
           </w:pPr>
-          <w:hyperlink w:anchor="_Toc201759696" w:history="1">
+          <w:hyperlink w:anchor="_Toc202186808" w:history="1">
             <w:r>
               <w:rPr>
                 <w:rStyle w:val="Hipervnculo"/>
@@ -843,7 +843,7 @@
                 <w:noProof/>
                 <w:webHidden/>
               </w:rPr>
-              <w:instrText xml:space="preserve"> PAGEREF _Toc201759696 \h </w:instrText>
+              <w:instrText xml:space="preserve"> PAGEREF _Toc202186808 \h </w:instrText>
             </w:r>
             <w:r>
               <w:rPr>
@@ -887,7 +887,7 @@
               <w:lang w:eastAsia="es-ES"/>
             </w:rPr>
           </w:pPr>
-          <w:hyperlink w:anchor="_Toc201759697" w:history="1">
+          <w:hyperlink w:anchor="_Toc202186809" w:history="1">
             <w:r>
               <w:rPr>
                 <w:rStyle w:val="Hipervnculo"/>
@@ -914,7 +914,7 @@
                 <w:noProof/>
                 <w:webHidden/>
               </w:rPr>
-              <w:instrText xml:space="preserve"> PAGEREF _Toc201759697 \h </w:instrText>
+              <w:instrText xml:space="preserve"> PAGEREF _Toc202186809 \h </w:instrText>
             </w:r>
             <w:r>
               <w:rPr>
@@ -958,7 +958,7 @@
               <w:lang w:eastAsia="es-ES"/>
             </w:rPr>
           </w:pPr>
-          <w:hyperlink w:anchor="_Toc201759698" w:history="1">
+          <w:hyperlink w:anchor="_Toc202186810" w:history="1">
             <w:r>
               <w:rPr>
                 <w:rStyle w:val="Hipervnculo"/>
@@ -985,7 +985,7 @@
                 <w:noProof/>
                 <w:webHidden/>
               </w:rPr>
-              <w:instrText xml:space="preserve"> PAGEREF _Toc201759698 \h </w:instrText>
+              <w:instrText xml:space="preserve"> PAGEREF _Toc202186810 \h </w:instrText>
             </w:r>
             <w:r>
               <w:rPr>
@@ -1029,7 +1029,7 @@
               <w:lang w:eastAsia="es-ES"/>
             </w:rPr>
           </w:pPr>
-          <w:hyperlink w:anchor="_Toc201759699" w:history="1">
+          <w:hyperlink w:anchor="_Toc202186811" w:history="1">
             <w:r>
               <w:rPr>
                 <w:rStyle w:val="Hipervnculo"/>
@@ -1056,7 +1056,7 @@
                 <w:noProof/>
                 <w:webHidden/>
               </w:rPr>
-              <w:instrText xml:space="preserve"> PAGEREF _Toc201759699 \h </w:instrText>
+              <w:instrText xml:space="preserve"> PAGEREF _Toc202186811 \h </w:instrText>
             </w:r>
             <w:r>
               <w:rPr>
@@ -1100,7 +1100,7 @@
               <w:lang w:eastAsia="es-ES"/>
             </w:rPr>
           </w:pPr>
-          <w:hyperlink w:anchor="_Toc201759700" w:history="1">
+          <w:hyperlink w:anchor="_Toc202186812" w:history="1">
             <w:r>
               <w:rPr>
                 <w:rStyle w:val="Hipervnculo"/>
@@ -1127,7 +1127,7 @@
                 <w:noProof/>
                 <w:webHidden/>
               </w:rPr>
-              <w:instrText xml:space="preserve"> PAGEREF _Toc201759700 \h </w:instrText>
+              <w:instrText xml:space="preserve"> PAGEREF _Toc202186812 \h </w:instrText>
             </w:r>
             <w:r>
               <w:rPr>
@@ -1147,7 +1147,7 @@
                 <w:noProof/>
                 <w:webHidden/>
               </w:rPr>
-              <w:t>4</w:t>
+              <w:t>3</w:t>
             </w:r>
             <w:r>
               <w:rPr>
@@ -1171,7 +1171,7 @@
               <w:lang w:eastAsia="es-ES"/>
             </w:rPr>
           </w:pPr>
-          <w:hyperlink w:anchor="_Toc201759701" w:history="1">
+          <w:hyperlink w:anchor="_Toc202186813" w:history="1">
             <w:r>
               <w:rPr>
                 <w:rStyle w:val="Hipervnculo"/>
@@ -1198,7 +1198,7 @@
                 <w:noProof/>
                 <w:webHidden/>
               </w:rPr>
-              <w:instrText xml:space="preserve"> PAGEREF _Toc201759701 \h </w:instrText>
+              <w:instrText xml:space="preserve"> PAGEREF _Toc202186813 \h </w:instrText>
             </w:r>
             <w:r>
               <w:rPr>
@@ -1218,7 +1218,7 @@
                 <w:noProof/>
                 <w:webHidden/>
               </w:rPr>
-              <w:t>4</w:t>
+              <w:t>3</w:t>
             </w:r>
             <w:r>
               <w:rPr>
@@ -1242,7 +1242,7 @@
               <w:lang w:eastAsia="es-ES"/>
             </w:rPr>
           </w:pPr>
-          <w:hyperlink w:anchor="_Toc201759702" w:history="1">
+          <w:hyperlink w:anchor="_Toc202186814" w:history="1">
             <w:r>
               <w:rPr>
                 <w:rStyle w:val="Hipervnculo"/>
@@ -1269,7 +1269,7 @@
                 <w:noProof/>
                 <w:webHidden/>
               </w:rPr>
-              <w:instrText xml:space="preserve"> PAGEREF _Toc201759702 \h </w:instrText>
+              <w:instrText xml:space="preserve"> PAGEREF _Toc202186814 \h </w:instrText>
             </w:r>
             <w:r>
               <w:rPr>
@@ -1289,7 +1289,7 @@
                 <w:noProof/>
                 <w:webHidden/>
               </w:rPr>
-              <w:t>4</w:t>
+              <w:t>3</w:t>
             </w:r>
             <w:r>
               <w:rPr>
@@ -1313,7 +1313,7 @@
               <w:lang w:eastAsia="es-ES"/>
             </w:rPr>
           </w:pPr>
-          <w:hyperlink w:anchor="_Toc201759703" w:history="1">
+          <w:hyperlink w:anchor="_Toc202186815" w:history="1">
             <w:r>
               <w:rPr>
                 <w:rStyle w:val="Hipervnculo"/>
@@ -1340,7 +1340,7 @@
                 <w:noProof/>
                 <w:webHidden/>
               </w:rPr>
-              <w:instrText xml:space="preserve"> PAGEREF _Toc201759703 \h </w:instrText>
+              <w:instrText xml:space="preserve"> PAGEREF _Toc202186815 \h </w:instrText>
             </w:r>
             <w:r>
               <w:rPr>
@@ -1384,7 +1384,7 @@
               <w:lang w:eastAsia="es-ES"/>
             </w:rPr>
           </w:pPr>
-          <w:hyperlink w:anchor="_Toc201759704" w:history="1">
+          <w:hyperlink w:anchor="_Toc202186816" w:history="1">
             <w:r>
               <w:rPr>
                 <w:rStyle w:val="Hipervnculo"/>
@@ -1411,7 +1411,7 @@
                 <w:noProof/>
                 <w:webHidden/>
               </w:rPr>
-              <w:instrText xml:space="preserve"> PAGEREF _Toc201759704 \h </w:instrText>
+              <w:instrText xml:space="preserve"> PAGEREF _Toc202186816 \h </w:instrText>
             </w:r>
             <w:r>
               <w:rPr>
@@ -1455,7 +1455,7 @@
               <w:lang w:eastAsia="es-ES"/>
             </w:rPr>
           </w:pPr>
-          <w:hyperlink w:anchor="_Toc201759705" w:history="1">
+          <w:hyperlink w:anchor="_Toc202186817" w:history="1">
             <w:r>
               <w:rPr>
                 <w:rStyle w:val="Hipervnculo"/>
@@ -1482,7 +1482,7 @@
                 <w:noProof/>
                 <w:webHidden/>
               </w:rPr>
-              <w:instrText xml:space="preserve"> PAGEREF _Toc201759705 \h </w:instrText>
+              <w:instrText xml:space="preserve"> PAGEREF _Toc202186817 \h </w:instrText>
             </w:r>
             <w:r>
               <w:rPr>
@@ -1526,7 +1526,7 @@
               <w:lang w:eastAsia="es-ES"/>
             </w:rPr>
           </w:pPr>
-          <w:hyperlink w:anchor="_Toc201759706" w:history="1">
+          <w:hyperlink w:anchor="_Toc202186818" w:history="1">
             <w:r>
               <w:rPr>
                 <w:rStyle w:val="Hipervnculo"/>
@@ -1553,7 +1553,7 @@
                 <w:noProof/>
                 <w:webHidden/>
               </w:rPr>
-              <w:instrText xml:space="preserve"> PAGEREF _Toc201759706 \h </w:instrText>
+              <w:instrText xml:space="preserve"> PAGEREF _Toc202186818 \h </w:instrText>
             </w:r>
             <w:r>
               <w:rPr>
@@ -1573,7 +1573,7 @@
                 <w:noProof/>
                 <w:webHidden/>
               </w:rPr>
-              <w:t>5</w:t>
+              <w:t>4</w:t>
             </w:r>
             <w:r>
               <w:rPr>
@@ -1597,7 +1597,7 @@
               <w:lang w:eastAsia="es-ES"/>
             </w:rPr>
           </w:pPr>
-          <w:hyperlink w:anchor="_Toc201759707" w:history="1">
+          <w:hyperlink w:anchor="_Toc202186819" w:history="1">
             <w:r>
               <w:rPr>
                 <w:rStyle w:val="Hipervnculo"/>
@@ -1624,7 +1624,7 @@
                 <w:noProof/>
                 <w:webHidden/>
               </w:rPr>
-              <w:instrText xml:space="preserve"> PAGEREF _Toc201759707 \h </w:instrText>
+              <w:instrText xml:space="preserve"> PAGEREF _Toc202186819 \h </w:instrText>
             </w:r>
             <w:r>
               <w:rPr>
@@ -1644,7 +1644,7 @@
                 <w:noProof/>
                 <w:webHidden/>
               </w:rPr>
-              <w:t>5</w:t>
+              <w:t>4</w:t>
             </w:r>
             <w:r>
               <w:rPr>
@@ -1668,7 +1668,7 @@
               <w:lang w:eastAsia="es-ES"/>
             </w:rPr>
           </w:pPr>
-          <w:hyperlink w:anchor="_Toc201759708" w:history="1">
+          <w:hyperlink w:anchor="_Toc202186820" w:history="1">
             <w:r>
               <w:rPr>
                 <w:rStyle w:val="Hipervnculo"/>
@@ -1695,7 +1695,7 @@
                 <w:noProof/>
                 <w:webHidden/>
               </w:rPr>
-              <w:instrText xml:space="preserve"> PAGEREF _Toc201759708 \h </w:instrText>
+              <w:instrText xml:space="preserve"> PAGEREF _Toc202186820 \h </w:instrText>
             </w:r>
             <w:r>
               <w:rPr>
@@ -1715,7 +1715,7 @@
                 <w:noProof/>
                 <w:webHidden/>
               </w:rPr>
-              <w:t>5</w:t>
+              <w:t>4</w:t>
             </w:r>
             <w:r>
               <w:rPr>
@@ -1739,7 +1739,7 @@
               <w:lang w:eastAsia="es-ES"/>
             </w:rPr>
           </w:pPr>
-          <w:hyperlink w:anchor="_Toc201759709" w:history="1">
+          <w:hyperlink w:anchor="_Toc202186821" w:history="1">
             <w:r>
               <w:rPr>
                 <w:rStyle w:val="Hipervnculo"/>
@@ -1766,7 +1766,7 @@
                 <w:noProof/>
                 <w:webHidden/>
               </w:rPr>
-              <w:instrText xml:space="preserve"> PAGEREF _Toc201759709 \h </w:instrText>
+              <w:instrText xml:space="preserve"> PAGEREF _Toc202186821 \h </w:instrText>
             </w:r>
             <w:r>
               <w:rPr>
@@ -1810,7 +1810,7 @@
               <w:lang w:eastAsia="es-ES"/>
             </w:rPr>
           </w:pPr>
-          <w:hyperlink w:anchor="_Toc201759710" w:history="1">
+          <w:hyperlink w:anchor="_Toc202186822" w:history="1">
             <w:r>
               <w:rPr>
                 <w:rStyle w:val="Hipervnculo"/>
@@ -1837,7 +1837,7 @@
                 <w:noProof/>
                 <w:webHidden/>
               </w:rPr>
-              <w:instrText xml:space="preserve"> PAGEREF _Toc201759710 \h </w:instrText>
+              <w:instrText xml:space="preserve"> PAGEREF _Toc202186822 \h </w:instrText>
             </w:r>
             <w:r>
               <w:rPr>
@@ -1881,7 +1881,7 @@
               <w:lang w:eastAsia="es-ES"/>
             </w:rPr>
           </w:pPr>
-          <w:hyperlink w:anchor="_Toc201759711" w:history="1">
+          <w:hyperlink w:anchor="_Toc202186823" w:history="1">
             <w:r>
               <w:rPr>
                 <w:rStyle w:val="Hipervnculo"/>
@@ -1908,7 +1908,7 @@
                 <w:noProof/>
                 <w:webHidden/>
               </w:rPr>
-              <w:instrText xml:space="preserve"> PAGEREF _Toc201759711 \h </w:instrText>
+              <w:instrText xml:space="preserve"> PAGEREF _Toc202186823 \h </w:instrText>
             </w:r>
             <w:r>
               <w:rPr>
@@ -1952,7 +1952,7 @@
               <w:lang w:eastAsia="es-ES"/>
             </w:rPr>
           </w:pPr>
-          <w:hyperlink w:anchor="_Toc201759712" w:history="1">
+          <w:hyperlink w:anchor="_Toc202186824" w:history="1">
             <w:r>
               <w:rPr>
                 <w:rStyle w:val="Hipervnculo"/>
@@ -1979,7 +1979,7 @@
                 <w:noProof/>
                 <w:webHidden/>
               </w:rPr>
-              <w:instrText xml:space="preserve"> PAGEREF _Toc201759712 \h </w:instrText>
+              <w:instrText xml:space="preserve"> PAGEREF _Toc202186824 \h </w:instrText>
             </w:r>
             <w:r>
               <w:rPr>
@@ -2023,7 +2023,7 @@
               <w:lang w:eastAsia="es-ES"/>
             </w:rPr>
           </w:pPr>
-          <w:hyperlink w:anchor="_Toc201759713" w:history="1">
+          <w:hyperlink w:anchor="_Toc202186825" w:history="1">
             <w:r>
               <w:rPr>
                 <w:rStyle w:val="Hipervnculo"/>
@@ -2050,7 +2050,7 @@
                 <w:noProof/>
                 <w:webHidden/>
               </w:rPr>
-              <w:instrText xml:space="preserve"> PAGEREF _Toc201759713 \h </w:instrText>
+              <w:instrText xml:space="preserve"> PAGEREF _Toc202186825 \h </w:instrText>
             </w:r>
             <w:r>
               <w:rPr>
@@ -2094,7 +2094,7 @@
               <w:lang w:eastAsia="es-ES"/>
             </w:rPr>
           </w:pPr>
-          <w:hyperlink w:anchor="_Toc201759714" w:history="1">
+          <w:hyperlink w:anchor="_Toc202186826" w:history="1">
             <w:r>
               <w:rPr>
                 <w:rStyle w:val="Hipervnculo"/>
@@ -2121,7 +2121,7 @@
                 <w:noProof/>
                 <w:webHidden/>
               </w:rPr>
-              <w:instrText xml:space="preserve"> PAGEREF _Toc201759714 \h </w:instrText>
+              <w:instrText xml:space="preserve"> PAGEREF _Toc202186826 \h </w:instrText>
             </w:r>
             <w:r>
               <w:rPr>
@@ -2165,7 +2165,7 @@
               <w:lang w:eastAsia="es-ES"/>
             </w:rPr>
           </w:pPr>
-          <w:hyperlink w:anchor="_Toc201759715" w:history="1">
+          <w:hyperlink w:anchor="_Toc202186827" w:history="1">
             <w:r>
               <w:rPr>
                 <w:rStyle w:val="Hipervnculo"/>
@@ -2192,7 +2192,7 @@
                 <w:noProof/>
                 <w:webHidden/>
               </w:rPr>
-              <w:instrText xml:space="preserve"> PAGEREF _Toc201759715 \h </w:instrText>
+              <w:instrText xml:space="preserve"> PAGEREF _Toc202186827 \h </w:instrText>
             </w:r>
             <w:r>
               <w:rPr>
@@ -2236,7 +2236,7 @@
               <w:lang w:eastAsia="es-ES"/>
             </w:rPr>
           </w:pPr>
-          <w:hyperlink w:anchor="_Toc201759716" w:history="1">
+          <w:hyperlink w:anchor="_Toc202186828" w:history="1">
             <w:r>
               <w:rPr>
                 <w:rStyle w:val="Hipervnculo"/>
@@ -2263,7 +2263,7 @@
                 <w:noProof/>
                 <w:webHidden/>
               </w:rPr>
-              <w:instrText xml:space="preserve"> PAGEREF _Toc201759716 \h </w:instrText>
+              <w:instrText xml:space="preserve"> PAGEREF _Toc202186828 \h </w:instrText>
             </w:r>
             <w:r>
               <w:rPr>
@@ -2307,7 +2307,7 @@
               <w:lang w:eastAsia="es-ES"/>
             </w:rPr>
           </w:pPr>
-          <w:hyperlink w:anchor="_Toc201759717" w:history="1">
+          <w:hyperlink w:anchor="_Toc202186829" w:history="1">
             <w:r>
               <w:rPr>
                 <w:rStyle w:val="Hipervnculo"/>
@@ -2334,7 +2334,7 @@
                 <w:noProof/>
                 <w:webHidden/>
               </w:rPr>
-              <w:instrText xml:space="preserve"> PAGEREF _Toc201759717 \h </w:instrText>
+              <w:instrText xml:space="preserve"> PAGEREF _Toc202186829 \h </w:instrText>
             </w:r>
             <w:r>
               <w:rPr>
@@ -2378,7 +2378,7 @@
               <w:lang w:eastAsia="es-ES"/>
             </w:rPr>
           </w:pPr>
-          <w:hyperlink w:anchor="_Toc201759718" w:history="1">
+          <w:hyperlink w:anchor="_Toc202186830" w:history="1">
             <w:r>
               <w:rPr>
                 <w:rStyle w:val="Hipervnculo"/>
@@ -2405,7 +2405,7 @@
                 <w:noProof/>
                 <w:webHidden/>
               </w:rPr>
-              <w:instrText xml:space="preserve"> PAGEREF _Toc201759718 \h </w:instrText>
+              <w:instrText xml:space="preserve"> PAGEREF _Toc202186830 \h </w:instrText>
             </w:r>
             <w:r>
               <w:rPr>
@@ -2425,7 +2425,7 @@
                 <w:noProof/>
                 <w:webHidden/>
               </w:rPr>
-              <w:t>8</w:t>
+              <w:t>7</w:t>
             </w:r>
             <w:r>
               <w:rPr>
@@ -2449,7 +2449,7 @@
               <w:lang w:eastAsia="es-ES"/>
             </w:rPr>
           </w:pPr>
-          <w:hyperlink w:anchor="_Toc201759719" w:history="1">
+          <w:hyperlink w:anchor="_Toc202186831" w:history="1">
             <w:r>
               <w:rPr>
                 <w:rStyle w:val="Hipervnculo"/>
@@ -2476,7 +2476,7 @@
                 <w:noProof/>
                 <w:webHidden/>
               </w:rPr>
-              <w:instrText xml:space="preserve"> PAGEREF _Toc201759719 \h </w:instrText>
+              <w:instrText xml:space="preserve"> PAGEREF _Toc202186831 \h </w:instrText>
             </w:r>
             <w:r>
               <w:rPr>
@@ -2520,27 +2520,13 @@
               <w:lang w:eastAsia="es-ES"/>
             </w:rPr>
           </w:pPr>
-          <w:hyperlink w:anchor="_Toc201759720" w:history="1">
+          <w:hyperlink w:anchor="_Toc202186832" w:history="1">
             <w:r>
               <w:rPr>
                 <w:rStyle w:val="Hipervnculo"/>
                 <w:noProof/>
               </w:rPr>
-              <w:t>5. Conducta y respu</w:t>
-            </w:r>
-            <w:r>
-              <w:rPr>
-                <w:rStyle w:val="Hipervnculo"/>
-                <w:noProof/>
-              </w:rPr>
-              <w:t>e</w:t>
-            </w:r>
-            <w:r>
-              <w:rPr>
-                <w:rStyle w:val="Hipervnculo"/>
-                <w:noProof/>
-              </w:rPr>
-              <w:t>stas en redes sociales:</w:t>
+              <w:t>5. Conducta y respuestas en redes sociales:</w:t>
             </w:r>
             <w:r>
               <w:rPr>
@@ -2561,7 +2547,7 @@
                 <w:noProof/>
                 <w:webHidden/>
               </w:rPr>
-              <w:instrText xml:space="preserve"> PAGEREF _Toc201759720 \h </w:instrText>
+              <w:instrText xml:space="preserve"> PAGEREF _Toc202186832 \h </w:instrText>
             </w:r>
             <w:r>
               <w:rPr>
@@ -2605,7 +2591,7 @@
               <w:lang w:eastAsia="es-ES"/>
             </w:rPr>
           </w:pPr>
-          <w:hyperlink w:anchor="_Toc201759721" w:history="1">
+          <w:hyperlink w:anchor="_Toc202186833" w:history="1">
             <w:r>
               <w:rPr>
                 <w:rStyle w:val="Hipervnculo"/>
@@ -2632,7 +2618,7 @@
                 <w:noProof/>
                 <w:webHidden/>
               </w:rPr>
-              <w:instrText xml:space="preserve"> PAGEREF _Toc201759721 \h </w:instrText>
+              <w:instrText xml:space="preserve"> PAGEREF _Toc202186833 \h </w:instrText>
             </w:r>
             <w:r>
               <w:rPr>
@@ -2676,7 +2662,7 @@
               <w:lang w:eastAsia="es-ES"/>
             </w:rPr>
           </w:pPr>
-          <w:hyperlink w:anchor="_Toc201759722" w:history="1">
+          <w:hyperlink w:anchor="_Toc202186834" w:history="1">
             <w:r>
               <w:rPr>
                 <w:rStyle w:val="Hipervnculo"/>
@@ -2703,7 +2689,7 @@
                 <w:noProof/>
                 <w:webHidden/>
               </w:rPr>
-              <w:instrText xml:space="preserve"> PAGEREF _Toc201759722 \h </w:instrText>
+              <w:instrText xml:space="preserve"> PAGEREF _Toc202186834 \h </w:instrText>
             </w:r>
             <w:r>
               <w:rPr>
@@ -2723,7 +2709,7 @@
                 <w:noProof/>
                 <w:webHidden/>
               </w:rPr>
-              <w:t>8</w:t>
+              <w:t>9</w:t>
             </w:r>
             <w:r>
               <w:rPr>
@@ -2747,7 +2733,7 @@
               <w:lang w:eastAsia="es-ES"/>
             </w:rPr>
           </w:pPr>
-          <w:hyperlink w:anchor="_Toc201759723" w:history="1">
+          <w:hyperlink w:anchor="_Toc202186835" w:history="1">
             <w:r>
               <w:rPr>
                 <w:rStyle w:val="Hipervnculo"/>
@@ -2774,7 +2760,7 @@
                 <w:noProof/>
                 <w:webHidden/>
               </w:rPr>
-              <w:instrText xml:space="preserve"> PAGEREF _Toc201759723 \h </w:instrText>
+              <w:instrText xml:space="preserve"> PAGEREF _Toc202186835 \h </w:instrText>
             </w:r>
             <w:r>
               <w:rPr>
@@ -2794,7 +2780,7 @@
                 <w:noProof/>
                 <w:webHidden/>
               </w:rPr>
-              <w:t>8</w:t>
+              <w:t>9</w:t>
             </w:r>
             <w:r>
               <w:rPr>
@@ -2822,16 +2808,10 @@
     </w:sdt>
     <w:p>
       <w:pPr>
-        <w:pStyle w:val="ISIL2024"/>
-        <w:jc w:val="both"/>
-      </w:pPr>
-    </w:p>
-    <w:p>
-      <w:pPr>
         <w:pStyle w:val="Ttulo1"/>
         <w:jc w:val="both"/>
       </w:pPr>
-      <w:bookmarkStart w:id="0" w:name="_Toc201759692"/>
+      <w:bookmarkStart w:id="0" w:name="_Toc202186804"/>
       <w:r>
         <w:t xml:space="preserve">1. </w:t>
       </w:r>
@@ -2850,7 +2830,7 @@
         <w:pStyle w:val="Ttulo3"/>
         <w:jc w:val="both"/>
       </w:pPr>
-      <w:bookmarkStart w:id="1" w:name="_Toc201759693"/>
+      <w:bookmarkStart w:id="1" w:name="_Toc202186805"/>
       <w:r>
         <w:t>Datos generales</w:t>
       </w:r>
@@ -3001,7 +2981,7 @@
         <w:pStyle w:val="Ttulo3"/>
         <w:jc w:val="both"/>
       </w:pPr>
-      <w:bookmarkStart w:id="2" w:name="_Toc201759694"/>
+      <w:bookmarkStart w:id="2" w:name="_Toc202186806"/>
       <w:r>
         <w:t>¿Por qué elegimos este producto?</w:t>
       </w:r>
@@ -3120,16 +3100,12 @@
     </w:p>
     <w:p>
       <w:pPr>
-        <w:jc w:val="both"/>
-      </w:pPr>
-    </w:p>
-    <w:p>
-      <w:pPr>
         <w:pStyle w:val="Ttulo1"/>
         <w:jc w:val="both"/>
       </w:pPr>
-      <w:bookmarkStart w:id="3" w:name="_Toc201759695"/>
-      <w:r>
+      <w:bookmarkStart w:id="3" w:name="_Toc202186807"/>
+      <w:r>
+        <w:lastRenderedPageBreak/>
         <w:t>2</w:t>
       </w:r>
       <w:r>
@@ -3150,7 +3126,7 @@
         <w:pStyle w:val="Ttulo3"/>
         <w:jc w:val="both"/>
       </w:pPr>
-      <w:bookmarkStart w:id="4" w:name="_Toc201759696"/>
+      <w:bookmarkStart w:id="4" w:name="_Toc202186808"/>
       <w:r>
         <w:t xml:space="preserve">Modelo </w:t>
       </w:r>
@@ -3223,7 +3199,7 @@
         <w:pStyle w:val="Ttulo1"/>
         <w:jc w:val="both"/>
       </w:pPr>
-      <w:bookmarkStart w:id="5" w:name="_Toc201759697"/>
+      <w:bookmarkStart w:id="5" w:name="_Toc202186809"/>
       <w:r>
         <w:t>3</w:t>
       </w:r>
@@ -3260,7 +3236,7 @@
         <w:pStyle w:val="Ttulo3"/>
         <w:jc w:val="both"/>
       </w:pPr>
-      <w:bookmarkStart w:id="6" w:name="_Toc201759698"/>
+      <w:bookmarkStart w:id="6" w:name="_Toc202186810"/>
       <w:r>
         <w:t>Nuevas tecnologías</w:t>
       </w:r>
@@ -3279,7 +3255,7 @@
         <w:pStyle w:val="Ttulo3"/>
         <w:jc w:val="both"/>
       </w:pPr>
-      <w:bookmarkStart w:id="7" w:name="_Toc201759699"/>
+      <w:bookmarkStart w:id="7" w:name="_Toc202186811"/>
       <w:r>
         <w:t>Uso de smartphones</w:t>
       </w:r>
@@ -3303,7 +3279,7 @@
         <w:pStyle w:val="Ttulo1"/>
         <w:jc w:val="both"/>
       </w:pPr>
-      <w:bookmarkStart w:id="8" w:name="_Toc201759700"/>
+      <w:bookmarkStart w:id="8" w:name="_Toc202186812"/>
       <w:r>
         <w:t>4</w:t>
       </w:r>
@@ -3334,7 +3310,7 @@
         <w:pStyle w:val="Ttulo3"/>
         <w:jc w:val="both"/>
       </w:pPr>
-      <w:bookmarkStart w:id="9" w:name="_Toc201759701"/>
+      <w:bookmarkStart w:id="9" w:name="_Toc202186813"/>
       <w:r>
         <w:t>a. Grupo objetivo:</w:t>
       </w:r>
@@ -3353,7 +3329,7 @@
         <w:pStyle w:val="Ttulo3"/>
         <w:jc w:val="both"/>
       </w:pPr>
-      <w:bookmarkStart w:id="10" w:name="_Toc201759702"/>
+      <w:bookmarkStart w:id="10" w:name="_Toc202186814"/>
       <w:r>
         <w:t>b. Hipótesis del problema:</w:t>
       </w:r>
@@ -3372,7 +3348,7 @@
         <w:pStyle w:val="Ttulo3"/>
         <w:jc w:val="both"/>
       </w:pPr>
-      <w:bookmarkStart w:id="11" w:name="_Toc201759703"/>
+      <w:bookmarkStart w:id="11" w:name="_Toc202186815"/>
       <w:r>
         <w:lastRenderedPageBreak/>
         <w:t>c. Validación preliminar:</w:t>
@@ -3397,7 +3373,7 @@
         <w:pStyle w:val="Ttulo1"/>
         <w:jc w:val="both"/>
       </w:pPr>
-      <w:bookmarkStart w:id="12" w:name="_Toc201759704"/>
+      <w:bookmarkStart w:id="12" w:name="_Toc202186816"/>
       <w:r>
         <w:t>5</w:t>
       </w:r>
@@ -3463,7 +3439,7 @@
         <w:pStyle w:val="Ttulo1"/>
         <w:jc w:val="both"/>
       </w:pPr>
-      <w:bookmarkStart w:id="13" w:name="_Toc201759705"/>
+      <w:bookmarkStart w:id="13" w:name="_Toc202186817"/>
       <w:r>
         <w:t>6</w:t>
       </w:r>
@@ -3493,12 +3469,9 @@
         <w:pStyle w:val="Ttulo3"/>
         <w:jc w:val="both"/>
       </w:pPr>
-      <w:bookmarkStart w:id="14" w:name="_Toc201759706"/>
-      <w:r>
-        <w:t xml:space="preserve">1. </w:t>
-      </w:r>
-      <w:r>
-        <w:t>Personas que necesitan servicios técnicos en el hogar</w:t>
+      <w:bookmarkStart w:id="14" w:name="_Toc202186818"/>
+      <w:r>
+        <w:t>1. Personas que necesitan servicios técnicos en el hogar</w:t>
       </w:r>
       <w:bookmarkEnd w:id="14"/>
     </w:p>
@@ -3515,12 +3488,9 @@
         <w:pStyle w:val="Ttulo3"/>
         <w:jc w:val="both"/>
       </w:pPr>
-      <w:bookmarkStart w:id="15" w:name="_Toc201759707"/>
-      <w:r>
-        <w:t xml:space="preserve">2. </w:t>
-      </w:r>
-      <w:r>
-        <w:t>Técnicos del hogar (gasfiteros, electricistas, etc.)</w:t>
+      <w:bookmarkStart w:id="15" w:name="_Toc202186819"/>
+      <w:r>
+        <w:t>2. Técnicos del hogar (gasfiteros, electricistas, etc.)</w:t>
       </w:r>
       <w:bookmarkEnd w:id="15"/>
     </w:p>
@@ -3545,12 +3515,9 @@
         <w:pStyle w:val="Ttulo3"/>
         <w:jc w:val="both"/>
       </w:pPr>
-      <w:bookmarkStart w:id="16" w:name="_Toc201759708"/>
-      <w:r>
-        <w:t xml:space="preserve">3. </w:t>
-      </w:r>
-      <w:r>
-        <w:t>Ferreterías y negocios locales relacionados</w:t>
+      <w:bookmarkStart w:id="16" w:name="_Toc202186820"/>
+      <w:r>
+        <w:t>3. Ferreterías y negocios locales relacionados</w:t>
       </w:r>
       <w:bookmarkEnd w:id="16"/>
     </w:p>
@@ -3577,7 +3544,7 @@
         <w:pStyle w:val="Ttulo1"/>
         <w:jc w:val="both"/>
       </w:pPr>
-      <w:bookmarkStart w:id="17" w:name="_Toc201759709"/>
+      <w:bookmarkStart w:id="17" w:name="_Toc202186821"/>
       <w:r>
         <w:lastRenderedPageBreak/>
         <w:t>7</w:t>
@@ -3597,7 +3564,7 @@
         <w:pStyle w:val="Ttulo3"/>
         <w:jc w:val="both"/>
       </w:pPr>
-      <w:bookmarkStart w:id="18" w:name="_Toc201759710"/>
+      <w:bookmarkStart w:id="18" w:name="_Toc202186822"/>
       <w:r>
         <w:t>Persona entrevistada</w:t>
       </w:r>
@@ -3694,7 +3661,7 @@
         <w:pStyle w:val="Ttulo3"/>
         <w:jc w:val="both"/>
       </w:pPr>
-      <w:bookmarkStart w:id="19" w:name="_Toc201759711"/>
+      <w:bookmarkStart w:id="19" w:name="_Toc202186823"/>
       <w:r>
         <w:t>Transcripción de la entrevista</w:t>
       </w:r>
@@ -4003,7 +3970,7 @@
         <w:pStyle w:val="Ttulo1"/>
         <w:jc w:val="both"/>
       </w:pPr>
-      <w:bookmarkStart w:id="20" w:name="_Toc201759712"/>
+      <w:bookmarkStart w:id="20" w:name="_Toc202186824"/>
       <w:r>
         <w:t>8</w:t>
       </w:r>
@@ -5285,7 +5252,7 @@
         <w:pStyle w:val="Ttulo1"/>
         <w:jc w:val="both"/>
       </w:pPr>
-      <w:bookmarkStart w:id="21" w:name="_Toc201759713"/>
+      <w:bookmarkStart w:id="21" w:name="_Toc202186825"/>
       <w:r>
         <w:lastRenderedPageBreak/>
         <w:t>9</w:t>
@@ -5308,15 +5275,9 @@
         <w:pStyle w:val="Ttulo3"/>
         <w:jc w:val="both"/>
       </w:pPr>
-      <w:bookmarkStart w:id="22" w:name="_Toc201759714"/>
-      <w:r>
-        <w:t>M</w:t>
-      </w:r>
-      <w:r>
-        <w:t xml:space="preserve">etodología </w:t>
-      </w:r>
-      <w:r>
-        <w:t>elegida (Lean Startup)</w:t>
+      <w:bookmarkStart w:id="22" w:name="_Toc202186826"/>
+      <w:r>
+        <w:t>Metodología elegida (Lean Startup)</w:t>
       </w:r>
       <w:bookmarkEnd w:id="22"/>
     </w:p>
@@ -5325,13 +5286,7 @@
         <w:jc w:val="both"/>
       </w:pPr>
       <w:r>
-        <w:t>Como plataforma, necesita</w:t>
-      </w:r>
-      <w:r>
-        <w:t>mos</w:t>
-      </w:r>
-      <w:r>
-        <w:t xml:space="preserve"> lanzar rápido un PMV que conecte técnicos y clientes para empezar a probar si el modelo funciona y es aceptado.</w:t>
+        <w:t>Como plataforma, necesitamos lanzar rápido un PMV que conecte técnicos y clientes para empezar a probar si el modelo funciona y es aceptado.</w:t>
       </w:r>
     </w:p>
     <w:p>
@@ -5368,7 +5323,7 @@
         <w:pStyle w:val="Ttulo1"/>
         <w:jc w:val="both"/>
       </w:pPr>
-      <w:bookmarkStart w:id="23" w:name="_Toc201759715"/>
+      <w:bookmarkStart w:id="23" w:name="_Toc202186827"/>
       <w:r>
         <w:t>10</w:t>
       </w:r>
@@ -5397,7 +5352,7 @@
       <w:pPr>
         <w:jc w:val="both"/>
       </w:pPr>
-      <w:bookmarkStart w:id="24" w:name="_Toc201759716"/>
+      <w:bookmarkStart w:id="24" w:name="_Toc202186828"/>
       <w:r>
         <w:rPr>
           <w:rStyle w:val="Ttulo3Car"/>
@@ -5425,22 +5380,16 @@
         <w:jc w:val="both"/>
       </w:pPr>
       <w:r>
-        <w:t>Jenny</w:t>
-      </w:r>
-      <w:r>
-        <w:t xml:space="preserve"> Peñafiel</w:t>
+        <w:t>Jenny Peñafiel</w:t>
       </w:r>
     </w:p>
     <w:p>
       <w:pPr>
         <w:pStyle w:val="Ttulo3"/>
       </w:pPr>
-      <w:bookmarkStart w:id="25" w:name="_Toc201759717"/>
-      <w:r>
-        <w:t xml:space="preserve">2. </w:t>
-      </w:r>
-      <w:r>
-        <w:t>Características sociodemográficas:</w:t>
+      <w:bookmarkStart w:id="25" w:name="_Toc202186829"/>
+      <w:r>
+        <w:t>2. Características sociodemográficas:</w:t>
       </w:r>
       <w:bookmarkEnd w:id="25"/>
     </w:p>
@@ -5552,12 +5501,9 @@
       <w:pPr>
         <w:pStyle w:val="Ttulo3"/>
       </w:pPr>
-      <w:bookmarkStart w:id="26" w:name="_Toc201759718"/>
-      <w:r>
-        <w:t xml:space="preserve">3. </w:t>
-      </w:r>
-      <w:r>
-        <w:t>Descripción de su personalidad:</w:t>
+      <w:bookmarkStart w:id="26" w:name="_Toc202186830"/>
+      <w:r>
+        <w:t>3. Descripción de su personalidad:</w:t>
       </w:r>
       <w:bookmarkEnd w:id="26"/>
     </w:p>
@@ -5574,13 +5520,7 @@
         <w:jc w:val="both"/>
       </w:pPr>
       <w:r>
-        <w:t>Prefiere planificar y resolver los problemas de su casa sin contratiempos</w:t>
-      </w:r>
-      <w:r>
-        <w:t xml:space="preserve"> y t</w:t>
-      </w:r>
-      <w:r>
-        <w:t>iende a ser precavida antes de tomar decisiones, buscando siempre referencias o recomendaciones.</w:t>
+        <w:t>Prefiere planificar y resolver los problemas de su casa sin contratiempos y tiende a ser precavida antes de tomar decisiones, buscando siempre referencias o recomendaciones.</w:t>
       </w:r>
     </w:p>
     <w:p>
@@ -5602,13 +5542,10 @@
       <w:pPr>
         <w:pStyle w:val="Ttulo3"/>
       </w:pPr>
-      <w:bookmarkStart w:id="27" w:name="_Toc201759719"/>
+      <w:bookmarkStart w:id="27" w:name="_Toc202186831"/>
       <w:r>
         <w:lastRenderedPageBreak/>
-        <w:t xml:space="preserve">4. </w:t>
-      </w:r>
-      <w:r>
-        <w:t>Análisis de sus intereses y objetivos:</w:t>
+        <w:t>4. Análisis de sus intereses y objetivos:</w:t>
       </w:r>
       <w:bookmarkEnd w:id="27"/>
     </w:p>
@@ -5633,25 +5570,16 @@
         <w:jc w:val="both"/>
       </w:pPr>
       <w:r>
-        <w:t>Su principal objetivo es encontrar soluciones prácticas sin perder tiempo ni exponerse a fraudes o malos servicios</w:t>
-      </w:r>
-      <w:r>
-        <w:t>, v</w:t>
-      </w:r>
-      <w:r>
-        <w:t>alora las opciones que le den seguridad y que permitan pagos digitales por comodidad.</w:t>
+        <w:t>Su principal objetivo es encontrar soluciones prácticas sin perder tiempo ni exponerse a fraudes o malos servicios, valora las opciones que le den seguridad y que permitan pagos digitales por comodidad.</w:t>
       </w:r>
     </w:p>
     <w:p>
       <w:pPr>
         <w:pStyle w:val="Ttulo3"/>
       </w:pPr>
-      <w:bookmarkStart w:id="28" w:name="_Toc201759720"/>
-      <w:r>
-        <w:t xml:space="preserve">5. </w:t>
-      </w:r>
-      <w:r>
-        <w:t>Conducta y respuestas en redes sociales:</w:t>
+      <w:bookmarkStart w:id="28" w:name="_Toc202186832"/>
+      <w:r>
+        <w:t>5. Conducta y respuestas en redes sociales:</w:t>
       </w:r>
       <w:bookmarkEnd w:id="28"/>
     </w:p>
@@ -5660,39 +5588,15 @@
         <w:jc w:val="both"/>
       </w:pPr>
       <w:r>
-        <w:t>Jenny usa redes como Facebook y WhatsApp principalmente para mantenerse en contacto con familia</w:t>
-      </w:r>
-      <w:r>
-        <w:t xml:space="preserve"> y</w:t>
-      </w:r>
-      <w:r>
-        <w:t xml:space="preserve"> amigo</w:t>
-      </w:r>
-      <w:r>
-        <w:t>s</w:t>
-      </w:r>
-      <w:r>
-        <w:t>.</w:t>
-      </w:r>
-    </w:p>
-    <w:p>
-      <w:pPr>
-        <w:jc w:val="both"/>
-      </w:pPr>
-      <w:r>
-        <w:t>Participa en grupos de vecinos o comunidades de su zona donde pide y ofrece recomendaciones</w:t>
-      </w:r>
-      <w:r>
-        <w:t>, n</w:t>
-      </w:r>
-      <w:r>
-        <w:t xml:space="preserve">o es muy activa comentando o </w:t>
-      </w:r>
-      <w:r>
-        <w:t>publicando</w:t>
-      </w:r>
-      <w:r>
-        <w:t xml:space="preserve"> pero observa y toma nota de lo que otros comparten.</w:t>
+        <w:t>Jenny usa redes como Facebook y WhatsApp principalmente para mantenerse en contacto con familia y amigos.</w:t>
+      </w:r>
+    </w:p>
+    <w:p>
+      <w:pPr>
+        <w:jc w:val="both"/>
+      </w:pPr>
+      <w:r>
+        <w:t>Participa en grupos de vecinos o comunidades de su zona donde pide y ofrece recomendaciones, no es muy activa comentando o publicando pero observa y toma nota de lo que otros comparten.</w:t>
       </w:r>
     </w:p>
     <w:p>
@@ -5713,7 +5617,7 @@
         <w:pStyle w:val="Ttulo1"/>
         <w:jc w:val="both"/>
       </w:pPr>
-      <w:bookmarkStart w:id="29" w:name="_Toc201759721"/>
+      <w:bookmarkStart w:id="29" w:name="_Toc202186833"/>
       <w:r>
         <w:t>1</w:t>
       </w:r>
@@ -5793,7 +5697,7 @@
         <w:pStyle w:val="Ttulo1"/>
         <w:jc w:val="both"/>
       </w:pPr>
-      <w:bookmarkStart w:id="30" w:name="_Toc201759722"/>
+      <w:bookmarkStart w:id="30" w:name="_Toc202186834"/>
       <w:r>
         <w:lastRenderedPageBreak/>
         <w:t xml:space="preserve">12. Business </w:t>
@@ -5885,7 +5789,7 @@
         <w:pStyle w:val="Ttulo1"/>
         <w:jc w:val="both"/>
       </w:pPr>
-      <w:bookmarkStart w:id="31" w:name="_Toc201759723"/>
+      <w:bookmarkStart w:id="31" w:name="_Toc202186835"/>
       <w:r>
         <w:t>13. PMV</w:t>
       </w:r>
@@ -5900,14 +5804,91 @@
       <w:pPr>
         <w:jc w:val="both"/>
       </w:pPr>
-    </w:p>
-    <w:p>
-      <w:pPr>
-        <w:jc w:val="both"/>
-      </w:pPr>
+      <w:r>
+        <w:rPr>
+          <w:b/>
+          <w:bCs/>
+        </w:rPr>
+        <w:t>L</w:t>
+      </w:r>
+      <w:r>
+        <w:rPr>
+          <w:b/>
+          <w:bCs/>
+        </w:rPr>
+        <w:t>anding page</w:t>
+      </w:r>
+      <w:r>
+        <w:rPr>
+          <w:b/>
+          <w:bCs/>
+        </w:rPr>
+        <w:t>:</w:t>
+      </w:r>
+      <w:r>
+        <w:t xml:space="preserve"> </w:t>
+      </w:r>
+      <w:hyperlink r:id="rId10" w:history="1">
+        <w:r>
+          <w:rPr>
+            <w:rStyle w:val="Hipervnculo"/>
+          </w:rPr>
+          <w:t>https://isil-arregla-pe.vercel.app/</w:t>
+        </w:r>
+      </w:hyperlink>
+    </w:p>
+    <w:p>
+      <w:pPr>
+        <w:jc w:val="both"/>
+      </w:pPr>
+      <w:r>
+        <w:rPr>
+          <w:noProof/>
+        </w:rPr>
+        <w:drawing>
+          <wp:inline distT="0" distB="0" distL="0" distR="0" wp14:anchorId="1DE0BE91" wp14:editId="5604595C">
+            <wp:extent cx="5579745" cy="2660015"/>
+            <wp:effectExtent l="19050" t="19050" r="20955" b="26035"/>
+            <wp:docPr id="4" name="Imagen 4"/>
+            <wp:cNvGraphicFramePr>
+              <a:graphicFrameLocks xmlns:a="http://schemas.openxmlformats.org/drawingml/2006/main" noChangeAspect="1"/>
+            </wp:cNvGraphicFramePr>
+            <a:graphic xmlns:a="http://schemas.openxmlformats.org/drawingml/2006/main">
+              <a:graphicData uri="http://schemas.openxmlformats.org/drawingml/2006/picture">
+                <pic:pic xmlns:pic="http://schemas.openxmlformats.org/drawingml/2006/picture">
+                  <pic:nvPicPr>
+                    <pic:cNvPr id="1" name=""/>
+                    <pic:cNvPicPr/>
+                  </pic:nvPicPr>
+                  <pic:blipFill>
+                    <a:blip r:embed="rId11"/>
+                    <a:stretch>
+                      <a:fillRect/>
+                    </a:stretch>
+                  </pic:blipFill>
+                  <pic:spPr>
+                    <a:xfrm>
+                      <a:off x="0" y="0"/>
+                      <a:ext cx="5579745" cy="2660015"/>
+                    </a:xfrm>
+                    <a:prstGeom prst="rect">
+                      <a:avLst/>
+                    </a:prstGeom>
+                    <a:ln>
+                      <a:solidFill>
+                        <a:schemeClr val="tx1"/>
+                      </a:solidFill>
+                    </a:ln>
+                  </pic:spPr>
+                </pic:pic>
+              </a:graphicData>
+            </a:graphic>
+          </wp:inline>
+        </w:drawing>
+      </w:r>
     </w:p>
     <w:sectPr>
-      <w:headerReference w:type="default" r:id="rId10"/>
+      <w:headerReference w:type="default" r:id="rId12"/>
       <w:pgSz w:w="11906" w:h="16838"/>
       <w:pgMar w:top="1701" w:right="1418" w:bottom="1418" w:left="1701" w:header="709" w:footer="709" w:gutter="0"/>
       <w:pgNumType w:start="0"/>
@@ -8672,6 +8653,30 @@
       <w:ind w:left="480"/>
     </w:pPr>
   </w:style>
+  <w:style w:type="character" w:styleId="Mencinsinresolver">
+    <w:name w:val="Unresolved Mention"/>
+    <w:basedOn w:val="Fuentedeprrafopredeter"/>
+    <w:uiPriority w:val="99"/>
+    <w:semiHidden/>
+    <w:unhideWhenUsed/>
+    <w:rsid w:val="00C70FD1"/>
+    <w:rPr>
+      <w:color w:val="605E5C"/>
+      <w:shd w:val="clear" w:color="auto" w:fill="E1DFDD"/>
+    </w:rPr>
+  </w:style>
+  <w:style w:type="character" w:styleId="Hipervnculovisitado">
+    <w:name w:val="FollowedHyperlink"/>
+    <w:basedOn w:val="Fuentedeprrafopredeter"/>
+    <w:uiPriority w:val="99"/>
+    <w:semiHidden/>
+    <w:unhideWhenUsed/>
+    <w:rsid w:val="00C70FD1"/>
+    <w:rPr>
+      <w:color w:val="954F72" w:themeColor="followedHyperlink"/>
+      <w:u w:val="single"/>
+    </w:rPr>
+  </w:style>
 </w:styles>
 </file>
 

</xml_diff>